<commit_message>
up to nine and cleaned
</commit_message>
<xml_diff>
--- a/docs/activities/03_05_activity/intro_quarto_markdown_activity.docx
+++ b/docs/activities/03_05_activity/intro_quarto_markdown_activity.docx
@@ -31,7 +31,7 @@
         <w:pStyle w:val="Date"/>
       </w:pPr>
       <w:r>
-        <w:t xml:space="preserve">2026-07-03</w:t>
+        <w:t xml:space="preserve">2026-07-04</w:t>
       </w:r>
     </w:p>
     <w:bookmarkStart w:id="17" w:name="before-you-start"/>
@@ -64,13 +64,7 @@
         <w:t xml:space="preserve"> </w:t>
       </w:r>
       <w:r>
-        <w:t xml:space="preserve">need to type</w:t>
-      </w:r>
-      <w:r>
-        <w:t xml:space="preserve"> </w:t>
-      </w:r>
-      <w:r>
-        <w:t xml:space="preserve">fast. Each step is small, and there is a finished template you can lean on.</w:t>
+        <w:t xml:space="preserve">need to type fast. Each step is small, and there is a finished template you can lean on.</w:t>
       </w:r>
     </w:p>
     <w:tbl>
@@ -231,19 +225,7 @@
               <w:t xml:space="preserve"> </w:t>
             </w:r>
             <w:r>
-              <w:t xml:space="preserve">folder. It already has the YAML,</w:t>
-            </w:r>
-            <w:r>
-              <w:t xml:space="preserve"> </w:t>
-            </w:r>
-            <w:r>
-              <w:t xml:space="preserve">the library chunk, a summary table, and a figure. You will study it in Step 6</w:t>
-            </w:r>
-            <w:r>
-              <w:t xml:space="preserve"> </w:t>
-            </w:r>
-            <w:r>
-              <w:t xml:space="preserve">and use it as a safety net if you fall behind.</w:t>
+              <w:t xml:space="preserve">folder. It already has the YAML, the library chunk, a summary table, and a figure. You will study it in Step 6 and use it as a safety net if you fall behind.</w:t>
             </w:r>
           </w:p>
           <w:p/>
@@ -401,21 +383,7 @@
                 <w:b/>
                 <w:bCs/>
               </w:rPr>
-              <w:t xml:space="preserve">exact t-test from</w:t>
-            </w:r>
-            <w:r>
-              <w:rPr>
-                <w:b/>
-                <w:bCs/>
-              </w:rPr>
-              <w:t xml:space="preserve"> </w:t>
-            </w:r>
-            <w:r>
-              <w:rPr>
-                <w:b/>
-                <w:bCs/>
-              </w:rPr>
-              <w:t xml:space="preserve">Worksheet 04</w:t>
+              <w:t xml:space="preserve">exact t-test from Worksheet 04</w:t>
             </w:r>
             <w:r>
               <w:t xml:space="preserve">, written up as a Quarto report. The t-statistic,</w:t>
@@ -431,31 +399,7 @@
               <w:t xml:space="preserve">p</w:t>
             </w:r>
             <w:r>
-              <w:t xml:space="preserve">-value, and</w:t>
-            </w:r>
-            <w:r>
-              <w:t xml:space="preserve"> </w:t>
-            </w:r>
-            <w:r>
-              <w:t xml:space="preserve">group means are dropped straight into the sentences with inline code, and it</w:t>
-            </w:r>
-            <w:r>
-              <w:t xml:space="preserve"> </w:t>
-            </w:r>
-            <w:r>
-              <w:t xml:space="preserve">renders to a clean Word document. That is the payoff of everything in this</w:t>
-            </w:r>
-            <w:r>
-              <w:t xml:space="preserve"> </w:t>
-            </w:r>
-            <w:r>
-              <w:t xml:space="preserve">activity: the analysis you already ran becomes a report that writes its own</w:t>
-            </w:r>
-            <w:r>
-              <w:t xml:space="preserve"> </w:t>
-            </w:r>
-            <w:r>
-              <w:t xml:space="preserve">numbers. Notice you would never copy a single value by hand.</w:t>
+              <w:t xml:space="preserve">-value, and group means are dropped straight into the sentences with inline code, and it renders to a clean Word document. That is the payoff of everything in this activity: the analysis you already ran becomes a report that writes its own numbers. Notice you would never copy a single value by hand.</w:t>
             </w:r>
           </w:p>
           <w:p/>
@@ -726,13 +670,7 @@
               <w:t xml:space="preserve"> </w:t>
             </w:r>
             <w:r>
-              <w:t xml:space="preserve">file is just plain text. You can open it anywhere, and it lives happily</w:t>
-            </w:r>
-            <w:r>
-              <w:t xml:space="preserve"> </w:t>
-            </w:r>
-            <w:r>
-              <w:t xml:space="preserve">inside your project like your scripts do.</w:t>
+              <w:t xml:space="preserve">file is just plain text. You can open it anywhere, and it lives happily inside your project like your scripts do.</w:t>
             </w:r>
           </w:p>
           <w:p/>
@@ -914,13 +852,7 @@
         <w:t xml:space="preserve"> </w:t>
       </w:r>
       <w:r>
-        <w:t xml:space="preserve">(Ctrl/Cmd + Shift + K). A blank-ish Word document should open</w:t>
-      </w:r>
-      <w:r>
-        <w:t xml:space="preserve"> </w:t>
-      </w:r>
-      <w:r>
-        <w:t xml:space="preserve">with your title on it. 🎉 You just made a Word file from plain text.</w:t>
+        <w:t xml:space="preserve">(Ctrl/Cmd + Shift + K). A blank-ish Word document should open with your title on it. 🎉 You just made a Word file from plain text.</w:t>
       </w:r>
     </w:p>
     <w:tbl>
@@ -1047,13 +979,7 @@
               <w:t xml:space="preserve"> </w:t>
             </w:r>
             <w:r>
-              <w:t xml:space="preserve">lines are alone on their own line and that</w:t>
-            </w:r>
-            <w:r>
-              <w:t xml:space="preserve"> </w:t>
-            </w:r>
-            <w:r>
-              <w:t xml:space="preserve">your indenting is spaces.</w:t>
+              <w:t xml:space="preserve">lines are alone on their own line and that your indenting is spaces.</w:t>
             </w:r>
           </w:p>
           <w:p/>
@@ -1214,13 +1140,7 @@
         <w:t xml:space="preserve">Ctrl/Cmd + Alt + I</w:t>
       </w:r>
       <w:r>
-        <w:t xml:space="preserve">, then make it load your packages and</w:t>
-      </w:r>
-      <w:r>
-        <w:t xml:space="preserve"> </w:t>
-      </w:r>
-      <w:r>
-        <w:t xml:space="preserve">data. Give it a short</w:t>
+        <w:t xml:space="preserve">, then make it load your packages and data. Give it a short</w:t>
       </w:r>
       <w:r>
         <w:t xml:space="preserve"> </w:t>
@@ -1505,13 +1425,7 @@
               <w:t xml:space="preserve"> </w:t>
             </w:r>
             <w:r>
-              <w:t xml:space="preserve">make errors easy to</w:t>
-            </w:r>
-            <w:r>
-              <w:t xml:space="preserve"> </w:t>
-            </w:r>
-            <w:r>
-              <w:t xml:space="preserve">find. No two chunks can share a name.</w:t>
+              <w:t xml:space="preserve">make errors easy to find. No two chunks can share a name.</w:t>
             </w:r>
           </w:p>
           <w:p/>
@@ -1850,13 +1764,7 @@
         <w:pStyle w:val="FirstParagraph"/>
       </w:pPr>
       <w:r>
-        <w:t xml:space="preserve">Now upgrade your YAML to match the downloaded template so the report gets a</w:t>
-      </w:r>
-      <w:r>
-        <w:t xml:space="preserve"> </w:t>
-      </w:r>
-      <w:r>
-        <w:t xml:space="preserve">table of contents and numbered sections:</w:t>
+        <w:t xml:space="preserve">Now upgrade your YAML to match the downloaded template so the report gets a table of contents and numbered sections:</w:t>
       </w:r>
     </w:p>
     <w:p>
@@ -2310,13 +2218,7 @@
         <w:t xml:space="preserve"> </w:t>
       </w:r>
       <w:r>
-        <w:t xml:space="preserve">block to build a Word file, a web page, and slides — all</w:t>
-      </w:r>
-      <w:r>
-        <w:t xml:space="preserve"> </w:t>
-      </w:r>
-      <w:r>
-        <w:t xml:space="preserve">from the same analysis:</w:t>
+        <w:t xml:space="preserve">block to build a Word file, a web page, and slides — all from the same analysis:</w:t>
       </w:r>
     </w:p>
     <w:p>
@@ -2718,19 +2620,7 @@
               </w:r>
             </w:hyperlink>
             <w:r>
-              <w:t xml:space="preserve">, render it as-is</w:t>
-            </w:r>
-            <w:r>
-              <w:t xml:space="preserve"> </w:t>
-            </w:r>
-            <w:r>
-              <w:t xml:space="preserve">to confirm your setup works, then compare it to your file chunk by chunk. For a</w:t>
-            </w:r>
-            <w:r>
-              <w:t xml:space="preserve"> </w:t>
-            </w:r>
-            <w:r>
-              <w:t xml:space="preserve">fuller example with a real statistical test, study</w:t>
+              <w:t xml:space="preserve">, render it as-is to confirm your setup works, then compare it to your file chunk by chunk. For a fuller example with a real statistical test, study</w:t>
             </w:r>
             <w:r>
               <w:t xml:space="preserve"> </w:t>
@@ -2852,13 +2742,7 @@
         <w:t xml:space="preserve"> </w:t>
       </w:r>
       <w:r>
-        <w:t xml:space="preserve">·</w:t>
-      </w:r>
-      <w:r>
-        <w:t xml:space="preserve"> </w:t>
-      </w:r>
-      <w:r>
-        <w:t xml:space="preserve">📖</w:t>
+        <w:t xml:space="preserve">· 📖</w:t>
       </w:r>
       <w:r>
         <w:t xml:space="preserve"> </w:t>
@@ -2875,13 +2759,7 @@
         <w:t xml:space="preserve"> </w:t>
       </w:r>
       <w:r>
-        <w:t xml:space="preserve">·</w:t>
-      </w:r>
-      <w:r>
-        <w:t xml:space="preserve"> </w:t>
-      </w:r>
-      <w:r>
-        <w:t xml:space="preserve">🌐</w:t>
+        <w:t xml:space="preserve">· 🌐</w:t>
       </w:r>
       <w:r>
         <w:t xml:space="preserve"> </w:t>

</xml_diff>